<commit_message>
Clean & Standardize Data
</commit_message>
<xml_diff>
--- a/text/Finlora Fraud Detection.docx
+++ b/text/Finlora Fraud Detection.docx
@@ -11,6 +11,7 @@
           <w:sz w:val="46"/>
         </w:rPr>
       </w:pPr>
+      <w:bookmarkStart w:id="0" w:name="_GoBack"/>
       <w:proofErr w:type="spellStart"/>
       <w:r>
         <w:rPr>
@@ -800,10 +801,9 @@
         <w:pStyle w:val="NormalWeb"/>
       </w:pPr>
     </w:p>
-    <w:p>
-      <w:bookmarkStart w:id="0" w:name="_GoBack"/>
-      <w:bookmarkEnd w:id="0"/>
-    </w:p>
+    <w:p/>
+    <w:bookmarkEnd w:id="0"/>
+    <w:p/>
     <w:sectPr>
       <w:pgSz w:w="11906" w:h="16838"/>
       <w:pgMar w:top="1440" w:right="1440" w:bottom="1440" w:left="1440" w:header="708" w:footer="708" w:gutter="0"/>

</xml_diff>